<commit_message>
Sua TC21 hoi dung cau hoi, bo test chay lai duoc nhieu lan
TC21 bao FAIL oan: mot dev server Vite cua du an khac dang chiem cong 3000
tren host nen fetch localhost:3000 tra 200 thay vi refused. Doi sang hoi
Docker xem service nao co anh xa port ra host - mien nhiem voi tien trinh
khac. Cung loai bay voi PostgreSQL 17 o muc 4.3.1, da ghi vao bao cao.

Bo test gio tu don trang thai o dau moi lan chay (mo khoa, xoa last_otp,
reset MFA cua sv01) nen khong con bat buoc docker compose down -v truoc.
Da chay 4 lan lien tiep, lan nao cung 25/25.

Co-Authored-By: Claude Opus 5 <noreply@anthropic.com>
</commit_message>
<xml_diff>
--- a/docs/BAO_CAO.docx
+++ b/docs/BAO_CAO.docx
@@ -7456,6 +7456,616 @@
         <w:t xml:space="preserve">dấu hiệu gián tiếp.</w:t>
       </w:r>
     </w:p>
+    <w:p>
+      <w:pPr>
+        <w:pStyle w:val="BodyText"/>
+      </w:pPr>
+      <w:r>
+        <w:t xml:space="preserve">Chính cái bẫy này lặp lại một lần nữa ở test case TC21, lần này đúng vào lúc tổng duyệt</w:t>
+      </w:r>
+      <w:r>
+        <w:t xml:space="preserve"> </w:t>
+      </w:r>
+      <w:r>
+        <w:t xml:space="preserve">demo. TC21 kiểm chứng D1 bằng cách gọi</w:t>
+      </w:r>
+      <w:r>
+        <w:t xml:space="preserve"> </w:t>
+      </w:r>
+      <w:r>
+        <w:rPr>
+          <w:rStyle w:val="VerbatimChar"/>
+        </w:rPr>
+        <w:t xml:space="preserve">fetch('http://localhost:3000/health')</w:t>
+      </w:r>
+      <w:r>
+        <w:t xml:space="preserve"> </w:t>
+      </w:r>
+      <w:r>
+        <w:t xml:space="preserve">và chờ</w:t>
+      </w:r>
+      <w:r>
+        <w:t xml:space="preserve"> </w:t>
+      </w:r>
+      <w:r>
+        <w:rPr>
+          <w:b/>
+          <w:bCs/>
+        </w:rPr>
+        <w:t xml:space="preserve">connection refused</w:t>
+      </w:r>
+      <w:r>
+        <w:t xml:space="preserve">. Lần chạy cuối cùng nó báo</w:t>
+      </w:r>
+      <w:r>
+        <w:t xml:space="preserve"> </w:t>
+      </w:r>
+      <w:r>
+        <w:rPr>
+          <w:b/>
+          <w:bCs/>
+        </w:rPr>
+        <w:t xml:space="preserve">FAIL</w:t>
+      </w:r>
+      <w:r>
+        <w:t xml:space="preserve">: lời gọi trả về</w:t>
+      </w:r>
+      <w:r>
+        <w:t xml:space="preserve"> </w:t>
+      </w:r>
+      <w:r>
+        <w:rPr>
+          <w:rStyle w:val="VerbatimChar"/>
+        </w:rPr>
+        <w:t xml:space="preserve">200 OK</w:t>
+      </w:r>
+      <w:r>
+        <w:t xml:space="preserve">. Truy</w:t>
+      </w:r>
+      <w:r>
+        <w:t xml:space="preserve"> </w:t>
+      </w:r>
+      <w:r>
+        <w:t xml:space="preserve">ra thì tiến trình đang nghe cổng 3000 là một dev server Vite của một dự án khác trên cùng</w:t>
+      </w:r>
+      <w:r>
+        <w:t xml:space="preserve"> </w:t>
+      </w:r>
+      <w:r>
+        <w:t xml:space="preserve">máy, hoàn toàn không liên quan đến container</w:t>
+      </w:r>
+      <w:r>
+        <w:t xml:space="preserve"> </w:t>
+      </w:r>
+      <w:r>
+        <w:rPr>
+          <w:rStyle w:val="VerbatimChar"/>
+        </w:rPr>
+        <w:t xml:space="preserve">app</w:t>
+      </w:r>
+      <w:r>
+        <w:t xml:space="preserve">.</w:t>
+      </w:r>
+    </w:p>
+    <w:p>
+      <w:pPr>
+        <w:pStyle w:val="BodyText"/>
+      </w:pPr>
+      <w:r>
+        <w:t xml:space="preserve">Phép kiểm chứng đã được sửa lại cho hỏi đúng câu hỏi — không hỏi "có ai trả lời ở cổng</w:t>
+      </w:r>
+      <w:r>
+        <w:t xml:space="preserve"> </w:t>
+      </w:r>
+      <w:r>
+        <w:t xml:space="preserve">3000 không", mà hỏi Docker "</w:t>
+      </w:r>
+      <w:r>
+        <w:rPr>
+          <w:rStyle w:val="VerbatimChar"/>
+        </w:rPr>
+        <w:t xml:space="preserve">app</w:t>
+      </w:r>
+      <w:r>
+        <w:t xml:space="preserve"> </w:t>
+      </w:r>
+      <w:r>
+        <w:t xml:space="preserve">có ánh xạ port ra host không":</w:t>
+      </w:r>
+    </w:p>
+    <w:p>
+      <w:pPr>
+        <w:pStyle w:val="SourceCode"/>
+      </w:pPr>
+      <w:r>
+        <w:rPr>
+          <w:rStyle w:val="KeywordTok"/>
+        </w:rPr>
+        <w:t xml:space="preserve">const</w:t>
+      </w:r>
+      <w:r>
+        <w:rPr>
+          <w:rStyle w:val="NormalTok"/>
+        </w:rPr>
+        <w:t xml:space="preserve"> ports </w:t>
+      </w:r>
+      <w:r>
+        <w:rPr>
+          <w:rStyle w:val="OperatorTok"/>
+        </w:rPr>
+        <w:t xml:space="preserve">=</w:t>
+      </w:r>
+      <w:r>
+        <w:rPr>
+          <w:rStyle w:val="NormalTok"/>
+        </w:rPr>
+        <w:t xml:space="preserve"> (svc) </w:t>
+      </w:r>
+      <w:r>
+        <w:rPr>
+          <w:rStyle w:val="KeywordTok"/>
+        </w:rPr>
+        <w:t xml:space="preserve">=&gt;</w:t>
+      </w:r>
+      <w:r>
+        <w:rPr>
+          <w:rStyle w:val="NormalTok"/>
+        </w:rPr>
+        <w:t xml:space="preserve"> </w:t>
+      </w:r>
+      <w:r>
+        <w:rPr>
+          <w:rStyle w:val="FunctionTok"/>
+        </w:rPr>
+        <w:t xml:space="preserve">execSync</w:t>
+      </w:r>
+      <w:r>
+        <w:rPr>
+          <w:rStyle w:val="NormalTok"/>
+        </w:rPr>
+        <w:t xml:space="preserve">(</w:t>
+      </w:r>
+      <w:r>
+        <w:rPr>
+          <w:rStyle w:val="VerbatimStringTok"/>
+        </w:rPr>
+        <w:t xml:space="preserve">`docker compose ps --format "{{.Ports}}" </w:t>
+      </w:r>
+      <w:r>
+        <w:rPr>
+          <w:rStyle w:val="SpecialCharTok"/>
+        </w:rPr>
+        <w:t xml:space="preserve">${</w:t>
+      </w:r>
+      <w:r>
+        <w:rPr>
+          <w:rStyle w:val="NormalTok"/>
+        </w:rPr>
+        <w:t xml:space="preserve">svc</w:t>
+      </w:r>
+      <w:r>
+        <w:rPr>
+          <w:rStyle w:val="SpecialCharTok"/>
+        </w:rPr>
+        <w:t xml:space="preserve">}</w:t>
+      </w:r>
+      <w:r>
+        <w:rPr>
+          <w:rStyle w:val="VerbatimStringTok"/>
+        </w:rPr>
+        <w:t xml:space="preserve">`</w:t>
+      </w:r>
+      <w:r>
+        <w:rPr>
+          <w:rStyle w:val="NormalTok"/>
+        </w:rPr>
+        <w:t xml:space="preserve">)</w:t>
+      </w:r>
+      <w:r>
+        <w:rPr>
+          <w:rStyle w:val="OperatorTok"/>
+        </w:rPr>
+        <w:t xml:space="preserve">.</w:t>
+      </w:r>
+      <w:r>
+        <w:rPr>
+          <w:rStyle w:val="FunctionTok"/>
+        </w:rPr>
+        <w:t xml:space="preserve">toString</w:t>
+      </w:r>
+      <w:r>
+        <w:rPr>
+          <w:rStyle w:val="NormalTok"/>
+        </w:rPr>
+        <w:t xml:space="preserve">()</w:t>
+      </w:r>
+      <w:r>
+        <w:rPr>
+          <w:rStyle w:val="OperatorTok"/>
+        </w:rPr>
+        <w:t xml:space="preserve">.</w:t>
+      </w:r>
+      <w:r>
+        <w:rPr>
+          <w:rStyle w:val="FunctionTok"/>
+        </w:rPr>
+        <w:t xml:space="preserve">trim</w:t>
+      </w:r>
+      <w:r>
+        <w:rPr>
+          <w:rStyle w:val="NormalTok"/>
+        </w:rPr>
+        <w:t xml:space="preserve">()</w:t>
+      </w:r>
+      <w:r>
+        <w:rPr>
+          <w:rStyle w:val="OperatorTok"/>
+        </w:rPr>
+        <w:t xml:space="preserve">;</w:t>
+      </w:r>
+      <w:r>
+        <w:br/>
+      </w:r>
+      <w:r>
+        <w:rPr>
+          <w:rStyle w:val="FunctionTok"/>
+        </w:rPr>
+        <w:t xml:space="preserve">check</w:t>
+      </w:r>
+      <w:r>
+        <w:rPr>
+          <w:rStyle w:val="NormalTok"/>
+        </w:rPr>
+        <w:t xml:space="preserve">(</w:t>
+      </w:r>
+      <w:r>
+        <w:rPr>
+          <w:rStyle w:val="StringTok"/>
+        </w:rPr>
+        <w:t xml:space="preserve">'TC21'</w:t>
+      </w:r>
+      <w:r>
+        <w:rPr>
+          <w:rStyle w:val="OperatorTok"/>
+        </w:rPr>
+        <w:t xml:space="preserve">,</w:t>
+      </w:r>
+      <w:r>
+        <w:rPr>
+          <w:rStyle w:val="NormalTok"/>
+        </w:rPr>
+        <w:t xml:space="preserve"> </w:t>
+      </w:r>
+      <w:r>
+        <w:rPr>
+          <w:rStyle w:val="OperatorTok"/>
+        </w:rPr>
+        <w:t xml:space="preserve">!</w:t>
+      </w:r>
+      <w:r>
+        <w:rPr>
+          <w:rStyle w:val="FunctionTok"/>
+        </w:rPr>
+        <w:t xml:space="preserve">ports</w:t>
+      </w:r>
+      <w:r>
+        <w:rPr>
+          <w:rStyle w:val="NormalTok"/>
+        </w:rPr>
+        <w:t xml:space="preserve">(</w:t>
+      </w:r>
+      <w:r>
+        <w:rPr>
+          <w:rStyle w:val="StringTok"/>
+        </w:rPr>
+        <w:t xml:space="preserve">'app'</w:t>
+      </w:r>
+      <w:r>
+        <w:rPr>
+          <w:rStyle w:val="NormalTok"/>
+        </w:rPr>
+        <w:t xml:space="preserve">)</w:t>
+      </w:r>
+      <w:r>
+        <w:rPr>
+          <w:rStyle w:val="OperatorTok"/>
+        </w:rPr>
+        <w:t xml:space="preserve">.</w:t>
+      </w:r>
+      <w:r>
+        <w:rPr>
+          <w:rStyle w:val="FunctionTok"/>
+        </w:rPr>
+        <w:t xml:space="preserve">includes</w:t>
+      </w:r>
+      <w:r>
+        <w:rPr>
+          <w:rStyle w:val="NormalTok"/>
+        </w:rPr>
+        <w:t xml:space="preserve">(</w:t>
+      </w:r>
+      <w:r>
+        <w:rPr>
+          <w:rStyle w:val="StringTok"/>
+        </w:rPr>
+        <w:t xml:space="preserve">'-&gt;'</w:t>
+      </w:r>
+      <w:r>
+        <w:rPr>
+          <w:rStyle w:val="NormalTok"/>
+        </w:rPr>
+        <w:t xml:space="preserve">) </w:t>
+      </w:r>
+      <w:r>
+        <w:rPr>
+          <w:rStyle w:val="OperatorTok"/>
+        </w:rPr>
+        <w:t xml:space="preserve">&amp;&amp;</w:t>
+      </w:r>
+      <w:r>
+        <w:rPr>
+          <w:rStyle w:val="NormalTok"/>
+        </w:rPr>
+        <w:t xml:space="preserve"> </w:t>
+      </w:r>
+      <w:r>
+        <w:rPr>
+          <w:rStyle w:val="OperatorTok"/>
+        </w:rPr>
+        <w:t xml:space="preserve">!</w:t>
+      </w:r>
+      <w:r>
+        <w:rPr>
+          <w:rStyle w:val="FunctionTok"/>
+        </w:rPr>
+        <w:t xml:space="preserve">ports</w:t>
+      </w:r>
+      <w:r>
+        <w:rPr>
+          <w:rStyle w:val="NormalTok"/>
+        </w:rPr>
+        <w:t xml:space="preserve">(</w:t>
+      </w:r>
+      <w:r>
+        <w:rPr>
+          <w:rStyle w:val="StringTok"/>
+        </w:rPr>
+        <w:t xml:space="preserve">'db'</w:t>
+      </w:r>
+      <w:r>
+        <w:rPr>
+          <w:rStyle w:val="NormalTok"/>
+        </w:rPr>
+        <w:t xml:space="preserve">)</w:t>
+      </w:r>
+      <w:r>
+        <w:rPr>
+          <w:rStyle w:val="OperatorTok"/>
+        </w:rPr>
+        <w:t xml:space="preserve">.</w:t>
+      </w:r>
+      <w:r>
+        <w:rPr>
+          <w:rStyle w:val="FunctionTok"/>
+        </w:rPr>
+        <w:t xml:space="preserve">includes</w:t>
+      </w:r>
+      <w:r>
+        <w:rPr>
+          <w:rStyle w:val="NormalTok"/>
+        </w:rPr>
+        <w:t xml:space="preserve">(</w:t>
+      </w:r>
+      <w:r>
+        <w:rPr>
+          <w:rStyle w:val="StringTok"/>
+        </w:rPr>
+        <w:t xml:space="preserve">'-&gt;'</w:t>
+      </w:r>
+      <w:r>
+        <w:rPr>
+          <w:rStyle w:val="NormalTok"/>
+        </w:rPr>
+        <w:t xml:space="preserve">) </w:t>
+      </w:r>
+      <w:r>
+        <w:rPr>
+          <w:rStyle w:val="OperatorTok"/>
+        </w:rPr>
+        <w:t xml:space="preserve">&amp;&amp;</w:t>
+      </w:r>
+      <w:r>
+        <w:rPr>
+          <w:rStyle w:val="NormalTok"/>
+        </w:rPr>
+        <w:t xml:space="preserve"> </w:t>
+      </w:r>
+      <w:r>
+        <w:rPr>
+          <w:rStyle w:val="FunctionTok"/>
+        </w:rPr>
+        <w:t xml:space="preserve">ports</w:t>
+      </w:r>
+      <w:r>
+        <w:rPr>
+          <w:rStyle w:val="NormalTok"/>
+        </w:rPr>
+        <w:t xml:space="preserve">(</w:t>
+      </w:r>
+      <w:r>
+        <w:rPr>
+          <w:rStyle w:val="StringTok"/>
+        </w:rPr>
+        <w:t xml:space="preserve">'waf'</w:t>
+      </w:r>
+      <w:r>
+        <w:rPr>
+          <w:rStyle w:val="NormalTok"/>
+        </w:rPr>
+        <w:t xml:space="preserve">)</w:t>
+      </w:r>
+      <w:r>
+        <w:rPr>
+          <w:rStyle w:val="OperatorTok"/>
+        </w:rPr>
+        <w:t xml:space="preserve">.</w:t>
+      </w:r>
+      <w:r>
+        <w:rPr>
+          <w:rStyle w:val="FunctionTok"/>
+        </w:rPr>
+        <w:t xml:space="preserve">includes</w:t>
+      </w:r>
+      <w:r>
+        <w:rPr>
+          <w:rStyle w:val="NormalTok"/>
+        </w:rPr>
+        <w:t xml:space="preserve">(</w:t>
+      </w:r>
+      <w:r>
+        <w:rPr>
+          <w:rStyle w:val="StringTok"/>
+        </w:rPr>
+        <w:t xml:space="preserve">'-&gt;'</w:t>
+      </w:r>
+      <w:r>
+        <w:rPr>
+          <w:rStyle w:val="NormalTok"/>
+        </w:rPr>
+        <w:t xml:space="preserve">)</w:t>
+      </w:r>
+      <w:r>
+        <w:rPr>
+          <w:rStyle w:val="OperatorTok"/>
+        </w:rPr>
+        <w:t xml:space="preserve">,</w:t>
+      </w:r>
+      <w:r>
+        <w:br/>
+      </w:r>
+      <w:r>
+        <w:rPr>
+          <w:rStyle w:val="NormalTok"/>
+        </w:rPr>
+        <w:t xml:space="preserve">  </w:t>
+      </w:r>
+      <w:r>
+        <w:rPr>
+          <w:rStyle w:val="StringTok"/>
+        </w:rPr>
+        <w:t xml:space="preserve">'chi waf anh xa port ra host, app va db thi khong'</w:t>
+      </w:r>
+      <w:r>
+        <w:rPr>
+          <w:rStyle w:val="NormalTok"/>
+        </w:rPr>
+        <w:t xml:space="preserve">)</w:t>
+      </w:r>
+      <w:r>
+        <w:rPr>
+          <w:rStyle w:val="OperatorTok"/>
+        </w:rPr>
+        <w:t xml:space="preserve">;</w:t>
+      </w:r>
+    </w:p>
+    <w:p>
+      <w:pPr>
+        <w:pStyle w:val="FirstParagraph"/>
+      </w:pPr>
+      <w:r>
+        <w:t xml:space="preserve">Cột</w:t>
+      </w:r>
+      <w:r>
+        <w:t xml:space="preserve"> </w:t>
+      </w:r>
+      <w:r>
+        <w:rPr>
+          <w:rStyle w:val="VerbatimChar"/>
+        </w:rPr>
+        <w:t xml:space="preserve">Ports</w:t>
+      </w:r>
+      <w:r>
+        <w:t xml:space="preserve"> </w:t>
+      </w:r>
+      <w:r>
+        <w:t xml:space="preserve">của</w:t>
+      </w:r>
+      <w:r>
+        <w:t xml:space="preserve"> </w:t>
+      </w:r>
+      <w:r>
+        <w:rPr>
+          <w:rStyle w:val="VerbatimChar"/>
+        </w:rPr>
+        <w:t xml:space="preserve">waf</w:t>
+      </w:r>
+      <w:r>
+        <w:t xml:space="preserve"> </w:t>
+      </w:r>
+      <w:r>
+        <w:t xml:space="preserve">có dạng</w:t>
+      </w:r>
+      <w:r>
+        <w:t xml:space="preserve"> </w:t>
+      </w:r>
+      <w:r>
+        <w:rPr>
+          <w:rStyle w:val="VerbatimChar"/>
+        </w:rPr>
+        <w:t xml:space="preserve">0.0.0.0:8080-&gt;8080/tcp</w:t>
+      </w:r>
+      <w:r>
+        <w:t xml:space="preserve">, của</w:t>
+      </w:r>
+      <w:r>
+        <w:t xml:space="preserve"> </w:t>
+      </w:r>
+      <w:r>
+        <w:rPr>
+          <w:rStyle w:val="VerbatimChar"/>
+        </w:rPr>
+        <w:t xml:space="preserve">app</w:t>
+      </w:r>
+      <w:r>
+        <w:t xml:space="preserve"> </w:t>
+      </w:r>
+      <w:r>
+        <w:t xml:space="preserve">chỉ là</w:t>
+      </w:r>
+      <w:r>
+        <w:t xml:space="preserve"> </w:t>
+      </w:r>
+      <w:r>
+        <w:rPr>
+          <w:rStyle w:val="VerbatimChar"/>
+        </w:rPr>
+        <w:t xml:space="preserve">3000/tcp</w:t>
+      </w:r>
+      <w:r>
+        <w:t xml:space="preserve">. Dấu</w:t>
+      </w:r>
+      <w:r>
+        <w:t xml:space="preserve"> </w:t>
+      </w:r>
+      <w:r>
+        <w:rPr>
+          <w:rStyle w:val="VerbatimChar"/>
+        </w:rPr>
+        <w:t xml:space="preserve">-&gt;</w:t>
+      </w:r>
+      <w:r>
+        <w:t xml:space="preserve"> </w:t>
+      </w:r>
+      <w:r>
+        <w:t xml:space="preserve">chính là ánh xạ ra host. Phép kiểm chứng mới miễn nhiễm với mọi tiến trình khác trên</w:t>
+      </w:r>
+      <w:r>
+        <w:t xml:space="preserve"> </w:t>
+      </w:r>
+      <w:r>
+        <w:t xml:space="preserve">máy, và khẳng định đúng điều cần khẳng định.</w:t>
+      </w:r>
+    </w:p>
     <w:bookmarkEnd w:id="38"/>
     <w:bookmarkEnd w:id="39"/>
     <w:bookmarkStart w:id="40" w:name="X31b4e01041b7da9b2cf42d989cc7fe444cc56f2"/>
@@ -20625,33 +21235,78 @@
               <w:pStyle w:val="Compact"/>
             </w:pPr>
             <w:r>
-              <w:t xml:space="preserve">Gọi thẳng</w:t>
-            </w:r>
-            <w:r>
-              <w:t xml:space="preserve"> </w:t>
-            </w:r>
-            <w:r>
-              <w:rPr>
-                <w:rStyle w:val="VerbatimChar"/>
-              </w:rPr>
-              <w:t xml:space="preserve">app:3000</w:t>
-            </w:r>
-            <w:r>
-              <w:t xml:space="preserve"> </w:t>
-            </w:r>
-            <w:r>
-              <w:t xml:space="preserve">từ host</w:t>
-            </w:r>
-          </w:p>
-        </w:tc>
-        <w:tc>
-          <w:tcPr/>
-          <w:p>
-            <w:pPr>
-              <w:pStyle w:val="Compact"/>
-            </w:pPr>
-            <w:r>
-              <w:t xml:space="preserve">Connection refused</w:t>
+              <w:t xml:space="preserve">Kiểm tra ánh xạ port của Docker cho cả 3 service</w:t>
+            </w:r>
+          </w:p>
+        </w:tc>
+        <w:tc>
+          <w:tcPr/>
+          <w:p>
+            <w:pPr>
+              <w:pStyle w:val="Compact"/>
+            </w:pPr>
+            <w:r>
+              <w:t xml:space="preserve">Chỉ</w:t>
+            </w:r>
+            <w:r>
+              <w:t xml:space="preserve"> </w:t>
+            </w:r>
+            <w:r>
+              <w:rPr>
+                <w:rStyle w:val="VerbatimChar"/>
+              </w:rPr>
+              <w:t xml:space="preserve">waf</w:t>
+            </w:r>
+            <w:r>
+              <w:t xml:space="preserve"> </w:t>
+            </w:r>
+            <w:r>
+              <w:t xml:space="preserve">có</w:t>
+            </w:r>
+            <w:r>
+              <w:t xml:space="preserve"> </w:t>
+            </w:r>
+            <w:r>
+              <w:rPr>
+                <w:rStyle w:val="VerbatimChar"/>
+              </w:rPr>
+              <w:t xml:space="preserve">-&gt;</w:t>
+            </w:r>
+            <w:r>
+              <w:t xml:space="preserve"> </w:t>
+            </w:r>
+            <w:r>
+              <w:t xml:space="preserve">ra host;</w:t>
+            </w:r>
+            <w:r>
+              <w:t xml:space="preserve"> </w:t>
+            </w:r>
+            <w:r>
+              <w:rPr>
+                <w:rStyle w:val="VerbatimChar"/>
+              </w:rPr>
+              <w:t xml:space="preserve">app</w:t>
+            </w:r>
+            <w:r>
+              <w:t xml:space="preserve"> </w:t>
+            </w:r>
+            <w:r>
+              <w:t xml:space="preserve">và</w:t>
+            </w:r>
+            <w:r>
+              <w:t xml:space="preserve"> </w:t>
+            </w:r>
+            <w:r>
+              <w:rPr>
+                <w:rStyle w:val="VerbatimChar"/>
+              </w:rPr>
+              <w:t xml:space="preserve">db</w:t>
+            </w:r>
+            <w:r>
+              <w:t xml:space="preserve"> </w:t>
+            </w:r>
+            <w:r>
+              <w:t xml:space="preserve">không có (xem 4.3.1)</w:t>
             </w:r>
           </w:p>
         </w:tc>

</xml_diff>

<commit_message>
Nhung style vao tung file .puml, bo !include de dan truc tiep duoc
Trinh chuyen doi online khong doc duoc file tren dia nen !include _style.puml
bao loi. Gio moi file tu chua, dan thang vao draw.io hay plantuml.com la hien.
Da render thu ca 8 file: checkonly va render deu exit 0.

Co-Authored-By: Claude Opus 5 <noreply@anthropic.com>
</commit_message>
<xml_diff>
--- a/docs/BAO_CAO.docx
+++ b/docs/BAO_CAO.docx
@@ -25375,7 +25375,7 @@
         <w:t xml:space="preserve"> </w:t>
       </w:r>
       <w:r>
-        <w:t xml:space="preserve">Bảng màu quy ước dùng chung cho cả tám sơ đồ nằm ở</w:t>
+        <w:t xml:space="preserve">Mỗi file tự chứa, không dùng</w:t>
       </w:r>
       <w:r>
         <w:t xml:space="preserve"> </w:t>
@@ -25384,10 +25384,16 @@
         <w:rPr>
           <w:rStyle w:val="VerbatimChar"/>
         </w:rPr>
-        <w:t xml:space="preserve">docs/diagrams/_style.puml</w:t>
-      </w:r>
-      <w:r>
-        <w:t xml:space="preserve">.</w:t>
+        <w:t xml:space="preserve">!include</w:t>
+      </w:r>
+      <w:r>
+        <w:t xml:space="preserve">, nên dán thẳng vào công cụ dựng sơ đồ là hiển</w:t>
+      </w:r>
+      <w:r>
+        <w:t xml:space="preserve"> </w:t>
+      </w:r>
+      <w:r>
+        <w:t xml:space="preserve">được; bảng màu quy ước lặp ở đầu cả tám file dưới dạng ghi chú.</w:t>
       </w:r>
     </w:p>
     <w:tbl>

</xml_diff>

<commit_message>
Chen 8 so do ve tay vao bao cao, dung lai bo slide tren Canva
- docs/diagrams: thay 8 anh cho trong bang ban ve tay xuat tu draw.io
- docs/BAO_CAO.docx: xuat lai de nhung dung 8 so do that
  (435 KB -> 1429 KB; truoc do van la anh "CHUA CHEN" mau do)
- docs/SLIDE.pptx: dung lai 12 slide tren Canva, nen navy, chen so do 1
  o slide 4, ghi chu nguoi noi du ca 12 trang

Canva tu sinh noi dung khong dung voi du an nen da thay lai toan bo
chu va so bang du lieu that trong docs/SLIDE.md. Dang chu y:
  - slide 7 ghi "verify RS256", du an dung HS256 co dinh
  - slide 10 bia 3 con so do ("+18 giay", "+34 ms", "2.1%"),
    so that la 1 sua/30 giay - 0/15 - 5-6 giay
  - slide 11 ghi OTP qua email, du an dung TOTP

Ban slide cu dung pandoc luu o docs/SLIDE-ban-cu-pandoc.pptx (chua commit).
Luu y: scripts/export-docs.py van ghi de SLIDE.pptx neu chay lai ca script.

Co-Authored-By: Claude Opus 5 <noreply@anthropic.com>
</commit_message>
<xml_diff>
--- a/docs/BAO_CAO.docx
+++ b/docs/BAO_CAO.docx
@@ -3278,7 +3278,7 @@
       <w:r>
         <w:drawing>
           <wp:inline>
-            <wp:extent cx="5334000" cy="5055276"/>
+            <wp:extent cx="5334000" cy="3330157"/>
             <wp:effectExtent b="0" l="0" r="0" t="0"/>
             <wp:docPr descr="Sơ đồ 3 — Use case và misuse case" title="" id="28" name="Picture"/>
             <a:graphic>
@@ -3299,7 +3299,7 @@
                   <pic:spPr bwMode="auto">
                     <a:xfrm>
                       <a:off x="0" y="0"/>
-                      <a:ext cx="5334000" cy="5055276"/>
+                      <a:ext cx="5334000" cy="3330157"/>
                     </a:xfrm>
                     <a:prstGeom prst="rect">
                       <a:avLst/>
@@ -5406,7 +5406,7 @@
       <w:r>
         <w:drawing>
           <wp:inline>
-            <wp:extent cx="5334000" cy="4078653"/>
+            <wp:extent cx="5334000" cy="4012513"/>
             <wp:effectExtent b="0" l="0" r="0" t="0"/>
             <wp:docPr descr="Sơ đồ 1 — Kiến trúc phân vùng" title="" id="34" name="Picture"/>
             <a:graphic>
@@ -5427,7 +5427,7 @@
                   <pic:spPr bwMode="auto">
                     <a:xfrm>
                       <a:off x="0" y="0"/>
-                      <a:ext cx="5334000" cy="4078653"/>
+                      <a:ext cx="5334000" cy="4012513"/>
                     </a:xfrm>
                     <a:prstGeom prst="rect">
                       <a:avLst/>
@@ -8524,7 +8524,7 @@
       <w:r>
         <w:drawing>
           <wp:inline>
-            <wp:extent cx="5334000" cy="5245996"/>
+            <wp:extent cx="5334000" cy="6614924"/>
             <wp:effectExtent b="0" l="0" r="0" t="0"/>
             <wp:docPr descr="Sơ đồ 2 — DFD mức 1" title="" id="42" name="Picture"/>
             <a:graphic>
@@ -8545,7 +8545,7 @@
                   <pic:spPr bwMode="auto">
                     <a:xfrm>
                       <a:off x="0" y="0"/>
-                      <a:ext cx="5334000" cy="5245996"/>
+                      <a:ext cx="5334000" cy="6614924"/>
                     </a:xfrm>
                     <a:prstGeom prst="rect">
                       <a:avLst/>
@@ -10048,7 +10048,7 @@
       <w:r>
         <w:drawing>
           <wp:inline>
-            <wp:extent cx="5334000" cy="4677587"/>
+            <wp:extent cx="5334000" cy="2728351"/>
             <wp:effectExtent b="0" l="0" r="0" t="0"/>
             <wp:docPr descr="Sơ đồ 8 — ERD" title="" id="50" name="Picture"/>
             <a:graphic>
@@ -10069,7 +10069,7 @@
                   <pic:spPr bwMode="auto">
                     <a:xfrm>
                       <a:off x="0" y="0"/>
-                      <a:ext cx="5334000" cy="4677587"/>
+                      <a:ext cx="5334000" cy="2728351"/>
                     </a:xfrm>
                     <a:prstGeom prst="rect">
                       <a:avLst/>
@@ -10707,7 +10707,7 @@
       <w:r>
         <w:drawing>
           <wp:inline>
-            <wp:extent cx="5334000" cy="8108108"/>
+            <wp:extent cx="5334000" cy="7015421"/>
             <wp:effectExtent b="0" l="0" r="0" t="0"/>
             <wp:docPr descr="Sơ đồ 4 — Sequence đăng nhập + MFA" title="" id="54" name="Picture"/>
             <a:graphic>
@@ -10728,7 +10728,7 @@
                   <pic:spPr bwMode="auto">
                     <a:xfrm>
                       <a:off x="0" y="0"/>
-                      <a:ext cx="5334000" cy="8108108"/>
+                      <a:ext cx="5334000" cy="7015421"/>
                     </a:xfrm>
                     <a:prstGeom prst="rect">
                       <a:avLst/>
@@ -12934,7 +12934,7 @@
       <w:r>
         <w:drawing>
           <wp:inline>
-            <wp:extent cx="5334000" cy="3693238"/>
+            <wp:extent cx="5334000" cy="3502968"/>
             <wp:effectExtent b="0" l="0" r="0" t="0"/>
             <wp:docPr descr="Sơ đồ 5 — Sequence sửa điểm" title="" id="62" name="Picture"/>
             <a:graphic>
@@ -12955,7 +12955,7 @@
                   <pic:spPr bwMode="auto">
                     <a:xfrm>
                       <a:off x="0" y="0"/>
-                      <a:ext cx="5334000" cy="3693238"/>
+                      <a:ext cx="5334000" cy="3502968"/>
                     </a:xfrm>
                     <a:prstGeom prst="rect">
                       <a:avLst/>
@@ -18511,7 +18511,7 @@
       <w:r>
         <w:drawing>
           <wp:inline>
-            <wp:extent cx="5334000" cy="5631344"/>
+            <wp:extent cx="5334000" cy="6104954"/>
             <wp:effectExtent b="0" l="0" r="0" t="0"/>
             <wp:docPr descr="Sơ đồ 7 — KB2 token bị đánh cắp" title="" id="92" name="Picture"/>
             <a:graphic>
@@ -18532,7 +18532,7 @@
                   <pic:spPr bwMode="auto">
                     <a:xfrm>
                       <a:off x="0" y="0"/>
-                      <a:ext cx="5334000" cy="5631344"/>
+                      <a:ext cx="5334000" cy="6104954"/>
                     </a:xfrm>
                     <a:prstGeom prst="rect">
                       <a:avLst/>

</xml_diff>